<commit_message>
Finalize Unit 20 FBZ requirements and evidence
</commit_message>
<xml_diff>
--- a/submission/Unit20_FBZ_Design_and_Programming_Report.docx
+++ b/submission/Unit20_FBZ_Design_and_Programming_Report.docx
@@ -185,7 +185,7 @@
     </w:p>
     <w:p>
       <w:r>
-        <w:t>The assignment scenario describes Fantasy Bazaar (FBZ), a local comic-book shop that needs a data-processing application around the British Library Comics Unmasked metadata. The required solution is not simply a working search script: the brief asks for investigation of object-oriented programming and SOLID principles, clean coding, design patterns and an automated testing regime. The functional scenario requires the dataset to be loaded into memory; users must be able to browse Fantasy, Horror and Science Fiction records, group them by author or publication year, order titles alphabetically in both directions, search manually by title, handle special characters, repeated values, missing ISBN values and multiple title rows, save results to an in-memory search list, perform advanced searches, and report popular searches/results. The later testing scenario requires evidence from automated tests and comparison of developer-produced and vendor/framework-supported testing approaches.</w:t>
+        <w:t>The assignment scenario describes Fantasy Bazaar (FBZ), a local comic-book shop needing a data-processing application around British Library Comics Unmasked metadata. The brief evaluates OOP/SOLID, clean coding, design patterns and automated testing. Functionally, the dataset is loaded into memory; users browse the three required genres, group by author or publication year, sort titles both ways, search titles, handle special characters, repeated values, missing entries and multiple title rows, save an in-memory search list, perform advanced searches, and report popular searches/results. The testing scenario additionally requires evidence from automated methods and comparison of developer-produced and vendor/framework-supported tooling.</w:t>
       </w:r>
     </w:p>
     <w:p>
@@ -806,7 +806,7 @@
     </w:tbl>
     <w:p>
       <w:r>
-        <w:t>Chebanyuk and Markov (2016) treat SOLID as structural design principles that can be examined through class relationships. In FBZ, the strongest practical effect is change isolation. A new search algorithm does not require rewriting existing search algorithms, and a different repository implementation can be supplied without rewriting the service. The cost is abstraction overhead: a tiny one-off script could be shorter without these boundaries. Because FBZ has multiple search behaviours, multiple source views, an XML extension point and a testing requirement, the additional structure is justified.</w:t>
+        <w:t>Chebanyuk and Markov (2016) treat SOLID as structural design principles. In FBZ, the strongest practical effect is change isolation: new search algorithms and repository implementations can be supplied without rewriting existing services. The cost is abstraction overhead; a tiny one-off script could be shorter. FBZ has multiple search behaviours, source views, an XML extension point and testing requirements, so the added structure is justified.</w:t>
       </w:r>
     </w:p>
     <w:p>
@@ -1227,6 +1227,38 @@
           </w:tcPr>
           <w:p>
             <w:r>
+              <w:t>Interactive group workflow</w:t>
+            </w:r>
+          </w:p>
+        </w:tc>
+        <w:tc>
+          <w:tcPr>
+            <w:tcW w:type="dxa" w:w="3360"/>
+          </w:tcPr>
+          <w:p>
+            <w:r>
+              <w:t>Genre → author/year → group selection → A–Z/Z–A</w:t>
+            </w:r>
+          </w:p>
+        </w:tc>
+        <w:tc>
+          <w:tcPr>
+            <w:tcW w:type="dxa" w:w="3360"/>
+          </w:tcPr>
+          <w:p>
+            <w:r>
+              <w:t>CLI E2E acceptance</w:t>
+            </w:r>
+          </w:p>
+        </w:tc>
+      </w:tr>
+      <w:tr>
+        <w:tc>
+          <w:tcPr>
+            <w:tcW w:type="dxa" w:w="3360"/>
+          </w:tcPr>
+          <w:p>
+            <w:r>
               <w:t>Special characters</w:t>
             </w:r>
           </w:p>
@@ -1269,7 +1301,7 @@
           </w:tcPr>
           <w:p>
             <w:r>
-              <w:t>Tokenisation of semicolon/slash-separated fields</w:t>
+              <w:t>Tokenisation of semicolon/slash/pipe-separated fields</w:t>
             </w:r>
           </w:p>
         </w:tc>
@@ -1280,6 +1312,70 @@
           <w:p>
             <w:r>
               <w:t>Real multi-value acceptance</w:t>
+            </w:r>
+          </w:p>
+        </w:tc>
+      </w:tr>
+      <w:tr>
+        <w:tc>
+          <w:tcPr>
+            <w:tcW w:type="dxa" w:w="3360"/>
+          </w:tcPr>
+          <w:p>
+            <w:r>
+              <w:t>Multi-value display</w:t>
+            </w:r>
+          </w:p>
+        </w:tc>
+        <w:tc>
+          <w:tcPr>
+            <w:tcW w:type="dxa" w:w="3360"/>
+          </w:tcPr>
+          <w:p>
+            <w:r>
+              <w:t>Every delimiter-packed field is displayed as separate values</w:t>
+            </w:r>
+          </w:p>
+        </w:tc>
+        <w:tc>
+          <w:tcPr>
+            <w:tcW w:type="dxa" w:w="3360"/>
+          </w:tcPr>
+          <w:p>
+            <w:r>
+              <w:t>Unit + real-data display acceptance</w:t>
+            </w:r>
+          </w:p>
+        </w:tc>
+      </w:tr>
+      <w:tr>
+        <w:tc>
+          <w:tcPr>
+            <w:tcW w:type="dxa" w:w="3360"/>
+          </w:tcPr>
+          <w:p>
+            <w:r>
+              <w:t>Missing values</w:t>
+            </w:r>
+          </w:p>
+        </w:tc>
+        <w:tc>
+          <w:tcPr>
+            <w:tcW w:type="dxa" w:w="3360"/>
+          </w:tcPr>
+          <w:p>
+            <w:r>
+              <w:t>All blank display fields normalise to `missing`</w:t>
+            </w:r>
+          </w:p>
+        </w:tc>
+        <w:tc>
+          <w:tcPr>
+            <w:tcW w:type="dxa" w:w="3360"/>
+          </w:tcPr>
+          <w:p>
+            <w:r>
+              <w:t>Real missing-Publisher acceptance</w:t>
             </w:r>
           </w:p>
         </w:tc>
@@ -1497,7 +1593,7 @@
     </w:p>
     <w:p>
       <w:r>
-        <w:t>The final suite contains 30 passing automated tests. The acceptance report records the five-view row counts, 54,147 aggregated records, exact genre counts, a real author query, a Unicode title, a missing ISBN, multi-value genre tokens, both sort directions and a deterministic threshold notification after 101 search inclusions. This evidence is stronger than a coverage number alone because each result is tied to an assignment requirement.</w:t>
+        <w:t>The final suite contains 33 passing automated tests. The acceptance report records the five-view row counts, 54,147 aggregated records, exact genre counts, a real author query, a Unicode title, universal missing-value display, missing ISBN, multi-value field display, both sort directions and a deterministic threshold notification after 101 search inclusions. This evidence is stronger than a coverage number alone because each result is tied to an assignment requirement.</w:t>
       </w:r>
     </w:p>
     <w:p>

</xml_diff>